<commit_message>
added showcase data import
</commit_message>
<xml_diff>
--- a/Project1/Project1v2.docx
+++ b/Project1/Project1v2.docx
@@ -933,16 +933,54 @@
       </w:r>
     </w:p>
     <w:p>
-      <w:r>
-        <w:t xml:space="preserve">Present report with slideshow in </w:t>
-      </w:r>
-      <w:proofErr w:type="gramStart"/>
-      <w:r>
-        <w:t>5 minute</w:t>
-      </w:r>
-      <w:proofErr w:type="gramEnd"/>
-      <w:r>
-        <w:t xml:space="preserve"> presentation on </w:t>
+      <w:pPr>
+        <w:numPr>
+          <w:ilvl w:val="0"/>
+          <w:numId w:val="5"/>
+        </w:numPr>
+        <w:spacing w:before="100" w:beforeAutospacing="1" w:after="100" w:afterAutospacing="1" w:line="240" w:lineRule="auto"/>
+        <w:rPr>
+          <w:rFonts w:ascii="Times New Roman" w:eastAsia="Times New Roman" w:hAnsi="Times New Roman" w:cs="Times New Roman"/>
+          <w:kern w:val="0"/>
+          <w14:ligatures w14:val="none"/>
+        </w:rPr>
+      </w:pPr>
+      <w:r>
+        <w:rPr>
+          <w:rFonts w:ascii="Times New Roman" w:eastAsia="Times New Roman" w:hAnsi="Times New Roman" w:cs="Times New Roman"/>
+          <w:b/>
+          <w:bCs/>
+          <w:kern w:val="0"/>
+          <w14:ligatures w14:val="none"/>
+        </w:rPr>
+        <w:t>Demonstration</w:t>
+      </w:r>
+      <w:r>
+        <w:rPr>
+          <w:rFonts w:ascii="Times New Roman" w:eastAsia="Times New Roman" w:hAnsi="Times New Roman" w:cs="Times New Roman"/>
+          <w:kern w:val="0"/>
+          <w14:ligatures w14:val="none"/>
+        </w:rPr>
+        <w:t>:</w:t>
+      </w:r>
+      <w:r>
+        <w:rPr>
+          <w:rFonts w:ascii="Times New Roman" w:eastAsia="Times New Roman" w:hAnsi="Times New Roman" w:cs="Times New Roman"/>
+          <w:kern w:val="0"/>
+          <w14:ligatures w14:val="none"/>
+        </w:rPr>
+        <w:t xml:space="preserve"> Present a short demonstration showcasing data importing</w:t>
+      </w:r>
+    </w:p>
+    <w:p>
+      <w:r>
+        <w:t>Present report with slideshow</w:t>
+      </w:r>
+      <w:r>
+        <w:t>, along with a short data import demonstration during the presentation,</w:t>
+      </w:r>
+      <w:r>
+        <w:t xml:space="preserve"> in 5 minute presentation on </w:t>
       </w:r>
       <w:r>
         <w:t xml:space="preserve">Mon. </w:t>

</xml_diff>